<commit_message>
Final audit: remove production notes from hallway, recess, restroom decks and guides (2 of 2)
</commit_message>
<xml_diff>
--- a/resources/systems/hallway.docx
+++ b/resources/systems/hallway.docx
@@ -688,7 +688,7 @@
           <w:color w:val="E21C24"/>
           <w:sz w:val="26"/>
         </w:rPr>
-        <w:t>TEACHER LANGUAGE TO PRESERVE</w:t>
+        <w:t>TEACHER LANGUAGE</w:t>
       </w:r>
     </w:p>
     <w:p>
@@ -749,21 +749,6 @@
           <w:sz w:val="22"/>
         </w:rPr>
         <w:t>"Reset. Walk it again."</w:t>
-      </w:r>
-    </w:p>
-    <w:p>
-      <w:pPr>
-        <w:pStyle w:val="ListBullet"/>
-      </w:pPr>
-      <w:r>
-        <w:rPr>
-          <w:rFonts w:ascii="Calibri" w:hAnsi="Calibri"/>
-          <w:b w:val="0"/>
-          <w:i w:val="0"/>
-          <w:color w:val="4A4A4A"/>
-          <w:sz w:val="22"/>
-        </w:rPr>
-        <w:t>Preserve any exact quoted lines from the source section above.</w:t>
       </w:r>
     </w:p>
     <w:p>

</xml_diff>

<commit_message>
Replace middle school hallway transitions with the Oct 2026 grades 5–8 procedure
Adds the full Middle School Hallway Transitions (Grades 5–8) procedure as a
reader page, a procedure .docx, and a grades 5–8 student handout. Rewrites the
6–8 hallway student deck and the 6–8 hallway cue card around the six numbered
expectations, roles, scripts, redirection ladder, and room moves. Updates only
the 6–8 rows and lines in the shared K–8 hallway documents to point to the new
procedure, and adds the new resources to the hub's Hallway Transitions card.

Co-Authored-By: Claude Opus 5.5 <noreply@anthropic.com>
Claude-Session: https://claude.ai/code/session_01NXpvYC6Eih5ak6KfhDGMZ4
</commit_message>
<xml_diff>
--- a/resources/systems/hallway.docx
+++ b/resources/systems/hallway.docx
@@ -1044,7 +1044,9 @@
             <w:shd w:val="clear" w:fill="FFFFFF"/>
           </w:tcPr>
           <w:p>
-            <w:r/>
+            <w:r>
+              <w:t>5-8</w:t>
+            </w:r>
             <w:r>
               <w:rPr>
                 <w:rFonts w:ascii="Calibri" w:hAnsi="Calibri"/>
@@ -1053,7 +1055,6 @@
                 <w:color w:val="4A4A4A"/>
                 <w:sz w:val="19"/>
               </w:rPr>
-              <w:t>6-8</w:t>
             </w:r>
           </w:p>
         </w:tc>
@@ -1063,7 +1064,9 @@
             <w:shd w:val="clear" w:fill="FFFFFF"/>
           </w:tcPr>
           <w:p>
-            <w:r/>
+            <w:r>
+              <w:t>Teach the six numbered expectations and the hallway script exactly as written in Middle School Hallway Transitions (Grades 5–8): toes pointed, hands to yourself, voice level 0, computer closed in two hands, walk on the right, walk in and start the First Five. You stay inside, front and center, and do not walk into the hall; the restorative team holds the hall (grade 5 teachers run their own transitions). Rehearse your grade's room move in the real hallway. Add: "Same words, every adult, every time."</w:t>
+            </w:r>
             <w:r>
               <w:rPr>
                 <w:rFonts w:ascii="Calibri" w:hAnsi="Calibri"/>
@@ -1072,7 +1075,6 @@
                 <w:color w:val="4A4A4A"/>
                 <w:sz w:val="19"/>
               </w:rPr>
-              <w:t>Skip the demonstration of student walking - too performative. Instead, walk the class through it as a group, with you at the front modeling. Add: "Other teachers are watching how you move through their hallway. You are representing me when I'm not there." Connect to ownership.</w:t>
             </w:r>
           </w:p>
         </w:tc>
@@ -1100,7 +1102,7 @@
           <w:color w:val="4A4A4A"/>
           <w:sz w:val="22"/>
         </w:rPr>
-        <w:t>The hallway routine runs every transition, every day. The first 30 days, you walk every transition with the class - even if it slows you down. After 30 days, students should be able to travel solo to a destination (bathroom, office) holding the four moves. Teachers: when the routine slips in the hallway, do not yell. Stop the class. Reset. Walk it again. Yelling in the hallway tells other classes that hallway behavior is up for negotiation. Reset language tells them it isn't.</w:t>
+        <w:t>The hallway routine runs every transition, every day. The first 30 days, you walk every transition with the class - even if it slows you down. After 30 days, students should be able to travel solo to a destination (bathroom, office) holding the four moves. Teachers: when the routine slips in the hallway, do not yell. Stop the class. Reset. Walk it again. Yelling in the hallway tells other classes that hallway behavior is up for negotiation. Reset language tells them it isn't. Grades 5–8: teachers do not walk the line. Follow Middle School Hallway Transitions (Grades 5–8), where teachers stay inside, front and center, and the restorative team holds the hall.</w:t>
       </w:r>
     </w:p>
     <w:p>

</xml_diff>